<commit_message>
Rework Gaia DR4 minute-timescale variability project
</commit_message>
<xml_diff>
--- a/04_Gaia_DR4_Minute_Timescale_Variability.docx
+++ b/04_Gaia_DR4_Minute_Timescale_Variability.docx
@@ -13,7 +13,7 @@
         <w:rPr>
           <w:rFonts w:ascii="Arial" w:hAnsi="Arial" w:cs="Arial"/>
         </w:rPr>
-        <w:t>Project Title: The Forty-Second Sky: Minute-timescale Variables in Gaia DR4</w:t>
+        <w:t>Project Title: The 40-Second Sky: Discovering Minute-timescale Variables with Gaia DR4</w:t>
       </w:r>
     </w:p>
     <w:p>
@@ -99,25 +99,25 @@
           <w:sz w:val="22"/>
           <w:szCs w:val="22"/>
         </w:rPr>
-        <w:t>Gaia is normally described as a long-baseline survey, but each visit also takes a short movie of the source. A typical transit across the astrometric field contains up to nine broad-G measurements whose centres are separated by about 4.85 seconds, spanning roughly forty seconds. Gaia DR4, scheduled for 2 December 2026, is expected to make this per-CCD photometry public for the first time on an enormous scale.</w:t>
-      </w:r>
-    </w:p>
-    <w:p>
-      <w:pPr>
-        <w:spacing w:before="40" w:after="0" w:line="360" w:lineRule="auto"/>
-        <w:rPr>
-          <w:rFonts w:ascii="Arial" w:hAnsi="Arial" w:cs="Arial"/>
-          <w:sz w:val="22"/>
-          <w:szCs w:val="22"/>
-        </w:rPr>
-      </w:pPr>
-      <w:r>
-        <w:rPr>
-          <w:rFonts w:ascii="Arial" w:hAnsi="Arial" w:cs="Arial"/>
-          <w:sz w:val="22"/>
-          <w:szCs w:val="22"/>
-        </w:rPr>
-        <w:t>The student will use these data to find and characterise variability on timescales from tens of seconds to about one hour. Rather than download the full multi-terabyte archive, the project will begin with the DR4 short-timescale candidate table and selected colour–magnitude samples, retrieving CCD light curves only for promising objects and matched controls. Empirical noise models, period and transient searches, scan-angle diagnostics, and injection–recovery tests will separate astrophysical signals from instrumental effects. The goal is a high-purity sample with a quantified selection function, followed by detailed study of a small number of pulsating stars, compact binaries, accreting systems, or flares.</w:t>
+        <w:t>Gaia is normally viewed as a long-baseline survey, but each passage across its focal plane also records a rapid sequence of measurements. A typical field-of-view transit provides up to nine G-band CCD measurements. Successive measurement centres are separated by about 4.85 seconds, yielding a sequence that lasts about 40 seconds. Gaia DR4, currently expected in December 2026, is planned to publish this per-CCD photometry. It will open a largely unexplored, all-sky window on brightness changes over seconds to minutes.</w:t>
+      </w:r>
+    </w:p>
+    <w:p>
+      <w:pPr>
+        <w:spacing w:before="40" w:after="0" w:line="360" w:lineRule="auto"/>
+        <w:rPr>
+          <w:rFonts w:ascii="Arial" w:hAnsi="Arial" w:cs="Arial"/>
+          <w:sz w:val="22"/>
+          <w:szCs w:val="22"/>
+        </w:rPr>
+      </w:pPr>
+      <w:r>
+        <w:rPr>
+          <w:rFonts w:ascii="Arial" w:hAnsi="Arial" w:cs="Arial"/>
+          <w:sz w:val="22"/>
+          <w:szCs w:val="22"/>
+        </w:rPr>
+        <w:t>The main aim is to discover and characterise new objects that vary during a single Gaia transit. The student will first establish the calibration using known rapid variables as positive controls and matched, apparently non-variable stars as negative controls. The search will then look for coherent changes across several consecutive CCD measurements rather than isolated discrepant points. Signals that recur across several CCDs in more than one transit will form the most secure class, but convincing one-off multi-CCD events will be retained and subjected to stricter checks. The search will begin with a well-measured pilot sample and expand across magnitude and sky towards an all-sky analysis. Its principal products will be a ranked candidate catalogue and a Gaia Hertzsprung-Russell diagram coloured by the incidence and strength of minute-timescale variability.</w:t>
       </w:r>
     </w:p>
     <w:p>
@@ -149,43 +149,43 @@
           <w:sz w:val="22"/>
           <w:szCs w:val="22"/>
         </w:rPr>
-        <w:t>Many of the most compact stellar systems reveal themselves on minute timescales. White dwarfs and hot subdwarfs pulsate as their interiors respond to composition and temperature; ultracompact binaries can eclipse or modulate on orbital periods of only minutes; magnetic and accreting compact objects show rapid spins, flickering and quasi-periodic oscillations. Fast stellar flares occupy a complementary transient regime. These signals are scientifically rich but poorly sampled by most all-sky surveys.</w:t>
-      </w:r>
-    </w:p>
-    <w:p>
-      <w:pPr>
-        <w:spacing w:before="40" w:after="0" w:line="360" w:lineRule="auto"/>
-        <w:rPr>
-          <w:rFonts w:ascii="Arial" w:hAnsi="Arial" w:cs="Arial"/>
-          <w:sz w:val="22"/>
-          <w:szCs w:val="22"/>
-        </w:rPr>
-      </w:pPr>
-      <w:r>
-        <w:rPr>
-          <w:rFonts w:ascii="Arial" w:hAnsi="Arial" w:cs="Arial"/>
-          <w:sz w:val="22"/>
-          <w:szCs w:val="22"/>
-        </w:rPr>
-        <w:t>Within one Gaia focal-plane transit, the astrometric-field CCDs give nearly regular sampling over about forty seconds. Repeated transits then provide many short blocks separated by the Gaia scanning law. This unusual window function is sensitive to rapid slopes, oscillations and bursts, but it contains strong aliases and a large gap between the intra-transit sequence and the next visit. The finite CCD integration also smooths signals close to the exposure time, so model light curves must be integrated over each exposure rather than evaluated at a single instant.</w:t>
-      </w:r>
-    </w:p>
-    <w:p>
-      <w:pPr>
-        <w:spacing w:before="40" w:after="0" w:line="360" w:lineRule="auto"/>
-        <w:rPr>
-          <w:rFonts w:ascii="Arial" w:hAnsi="Arial" w:cs="Arial"/>
-          <w:sz w:val="22"/>
-          <w:szCs w:val="22"/>
-        </w:rPr>
-      </w:pPr>
-      <w:r>
-        <w:rPr>
-          <w:rFonts w:ascii="Arial" w:hAnsi="Arial" w:cs="Arial"/>
-          <w:sz w:val="22"/>
-          <w:szCs w:val="22"/>
-        </w:rPr>
-        <w:t>The scale of DR4 makes artefact control the central challenge. Blends can change brightness with scan angle; gates and window classes can create repeatable offsets; cosmic rays or background failures may mimic single-point flashes; and measurements within one transit have correlated errors. A tiny false-positive rate still produces thousands of spurious sources when millions are tested. The project will therefore favour coherent signals in adjacent CCDs or repeated visits, model the empirical null distribution and measure performance through signal injection.</w:t>
+        <w:t>Rapid brightness changes arise from many kinds of astrophysical system. Pulsating white dwarfs, hot subdwarfs, and other compact pulsators probe stellar interiors; close binaries can eclipse or modulate on periods of minutes; accreting and magnetic systems flicker or spin; and active stars produce short flares. Many searches at comparable cadence are confined to selected fields, target classes, or observing campaigns. Gaia instead repeatedly scans the whole sky. This project will therefore search without imposing a stellar type or a preferred light-curve shape, allowing familiar populations and unexpected objects to emerge from the data.</w:t>
+      </w:r>
+    </w:p>
+    <w:p>
+      <w:pPr>
+        <w:spacing w:before="40" w:after="0" w:line="360" w:lineRule="auto"/>
+        <w:rPr>
+          <w:rFonts w:ascii="Arial" w:hAnsi="Arial" w:cs="Arial"/>
+          <w:sz w:val="22"/>
+          <w:szCs w:val="22"/>
+        </w:rPr>
+      </w:pPr>
+      <w:r>
+        <w:rPr>
+          <w:rFonts w:ascii="Arial" w:hAnsi="Arial" w:cs="Arial"/>
+          <w:sz w:val="22"/>
+          <w:szCs w:val="22"/>
+        </w:rPr>
+        <w:t>The Gaia DR2 short-timescale analysis demonstrated both the promise and the difficulty of this experiment. Roelens et al. (2018) used internal per-CCD measurements to publish 3,018 candidates, including known compact binaries and newly identified variables, but the sample was deliberately incomplete and contained substantial contamination. DR4 is expected to make CCD-level G-band time series available to the community. A single transit may record only a slope, dip, peak, or part of an oscillation, so the initial search should test for coherent departures from constant brightness rather than demand a complete periodic cycle. Later transits can confirm recurring behaviour, while strong single-transit events remain possible discoveries.</w:t>
+      </w:r>
+    </w:p>
+    <w:p>
+      <w:pPr>
+        <w:spacing w:before="40" w:after="0" w:line="360" w:lineRule="auto"/>
+        <w:rPr>
+          <w:rFonts w:ascii="Arial" w:hAnsi="Arial" w:cs="Arial"/>
+          <w:sz w:val="22"/>
+          <w:szCs w:val="22"/>
+        </w:rPr>
+      </w:pPr>
+      <w:r>
+        <w:rPr>
+          <w:rFonts w:ascii="Arial" w:hAnsi="Arial" w:cs="Arial"/>
+          <w:sz w:val="22"/>
+          <w:szCs w:val="22"/>
+        </w:rPr>
+        <w:t>False positives are the central challenge. At Gaia's scale, even a tiny failure rate can produce many spurious candidates. Scan-angle-dependent blends, close neighbours, changing gates or window configurations, background errors, saturation, and source-assignment problems can all imitate variability (Roelens et al. 2018; Riello et al. 2021; Holl et al. 2023). Requiring several adjacent CCDs to change coherently will reject many isolated glitches, but it cannot remove every systematic effect.</w:t>
       </w:r>
     </w:p>
     <w:p>
@@ -217,7 +217,7 @@
           <w:sz w:val="22"/>
           <w:szCs w:val="22"/>
         </w:rPr>
-        <w:t>The project begins before the scheduled DR4 release. Michaelmas term will be used to build simulations, controls and retrieval tools; the final schema and known-issues documentation will then determine the exact sample. The core analysis is deliberately targeted and does not require a blind download of the expected 23-terabyte CCD-photometry product.</w:t>
+        <w:t>The work will proceed in two stages. Before DR4, the student will assemble calibration samples and write and test the retrieval, detection, and ranking code. Once DR4 becomes available, the method will be recalibrated on the released per-CCD measurements, tested on a pilot sample, and then expanded. If the release schedule or final data model changes, the calibration samples and tested code will remain useful.</w:t>
       </w:r>
     </w:p>
     <w:p>
@@ -243,15 +243,15 @@
           <w:b/>
           <w:bCs/>
         </w:rPr>
-        <w:t xml:space="preserve">Prepare the experiment before DR4. </w:t>
-      </w:r>
-      <w:r>
-        <w:rPr>
-          <w:rFonts w:ascii="Arial" w:hAnsi="Arial" w:cs="Arial"/>
-          <w:sz w:val="22"/>
-          <w:szCs w:val="22"/>
-        </w:rPr>
-        <w:t>Reproduce the logic of the published Gaia DR2 short-timescale search, construct the Gaia intra-transit sampling and exposure-integration model, and resample known TESS or Kepler rapid variables as Gaia would observe them. Assemble positive controls and apparently constant comparison stars spanning magnitude, colour and field density.</w:t>
+        <w:t xml:space="preserve">Prepare before Gaia DR4. </w:t>
+      </w:r>
+      <w:r>
+        <w:rPr>
+          <w:rFonts w:ascii="Arial" w:hAnsi="Arial" w:cs="Arial"/>
+          <w:sz w:val="22"/>
+          <w:szCs w:val="22"/>
+        </w:rPr>
+        <w:t>Assemble known rapid variables and matched apparently non-variable stars spanning magnitude, colour, and crowding. Existing Gaia products will test the archive and analysis infrastructure; high-cadence external light curves and injected Gaia-like CCD sequences will test the rapid-variability logic itself.</w:t>
       </w:r>
     </w:p>
     <w:p>
@@ -277,15 +277,15 @@
           <w:b/>
           <w:bCs/>
         </w:rPr>
-        <w:t xml:space="preserve">Validate the released measurements. </w:t>
-      </w:r>
-      <w:r>
-        <w:rPr>
-          <w:rFonts w:ascii="Arial" w:hAnsi="Arial" w:cs="Arial"/>
-          <w:sz w:val="22"/>
-          <w:szCs w:val="22"/>
-        </w:rPr>
-        <w:t>After DR4 appears, retrieve a small pilot sample and verify time units, CCD ordering, uncertainties, flags, gates and missing observations. Join the CCD photometry to the variability flags and scan-angle-dependent spurious-signal diagnostics. Build an empirical noise model as a function of magnitude, colour, CCD, gate or window configuration, background, epoch and crowding.</w:t>
+        <w:t xml:space="preserve">Establish the DR4 calibration. </w:t>
+      </w:r>
+      <w:r>
+        <w:rPr>
+          <w:rFonts w:ascii="Arial" w:hAnsi="Arial" w:cs="Arial"/>
+          <w:sz w:val="22"/>
+          <w:szCs w:val="22"/>
+        </w:rPr>
+        <w:t>Begin with a small pilot sample and check the measurement ordering, uncertainties, flags, and observing configurations. Measure how often known rapid variables are recovered and how often matched controls trigger the search. These tests will define the useful magnitude range and a calibrated variability significance.</w:t>
       </w:r>
     </w:p>
     <w:p>
@@ -311,15 +311,15 @@
           <w:b/>
           <w:bCs/>
         </w:rPr>
-        <w:t xml:space="preserve">Define a feasible search sample. </w:t>
-      </w:r>
-      <w:r>
-        <w:rPr>
-          <w:rFonts w:ascii="Arial" w:hAnsi="Arial" w:cs="Arial"/>
-          <w:sz w:val="22"/>
-          <w:szCs w:val="22"/>
-        </w:rPr>
-        <w:t>Start from a ranked subset of the expected vari_short_timescale table, known rapid variables and matched controls. Add targeted samples not selected by the Gaia variability pipeline, such as white dwarfs, hot subdwarfs, A stars and nearby late-type dwarfs. Retrieve epoch_photometry_ccd through DataLink only for these source lists, allowing the project to test incompleteness without processing every Gaia source.</w:t>
+        <w:t xml:space="preserve">Search for coherent changes. </w:t>
+      </w:r>
+      <w:r>
+        <w:rPr>
+          <w:rFonts w:ascii="Arial" w:hAnsi="Arial" w:cs="Arial"/>
+          <w:sz w:val="22"/>
+          <w:szCs w:val="22"/>
+        </w:rPr>
+        <w:t>Test each transit against constant brightness and use simple, robust statistics sensitive to slopes, peaks, dips, and other ordered changes. Require the signal to extend across several consecutive CCD measurements. The search will remain shape-agnostic and will not preselect a stellar class.</w:t>
       </w:r>
     </w:p>
     <w:p>
@@ -345,15 +345,15 @@
           <w:b/>
           <w:bCs/>
         </w:rPr>
-        <w:t xml:space="preserve">Search for periodic and transient signals. </w:t>
-      </w:r>
-      <w:r>
-        <w:rPr>
-          <w:rFonts w:ascii="Arial" w:hAnsi="Arial" w:cs="Arial"/>
-          <w:sz w:val="22"/>
-          <w:szCs w:val="22"/>
-        </w:rPr>
-        <w:t>Use robust constant-flux likelihoods, weighted variograms and within-transit slope or curvature statistics for detection. Periodic candidates will be examined with multiharmonic periodograms, phase-dispersion methods and eclipsing templates; flares and other one-off events will use change-point and fast-rise/slow-decay models. Each object's spectral window will be calculated explicitly, and visits will be resampled as correlated blocks.</w:t>
+        <w:t xml:space="preserve">Rank every credible candidate. </w:t>
+      </w:r>
+      <w:r>
+        <w:rPr>
+          <w:rFonts w:ascii="Arial" w:hAnsi="Arial" w:cs="Arial"/>
+          <w:sz w:val="22"/>
+          <w:szCs w:val="22"/>
+        </w:rPr>
+        <w:t>Multi-CCD signals that recur in more than one transit will receive the highest confidence. A single-transit event will remain in the catalogue when it is coherent across several CCDs, significant relative to matched controls, and free of obvious instrumental warnings. The ranking will record signal strength, duration, repeatability, and the evidence against an artefact.</w:t>
       </w:r>
     </w:p>
     <w:p>
@@ -379,15 +379,15 @@
           <w:b/>
           <w:bCs/>
         </w:rPr>
-        <w:t xml:space="preserve">Reject instrumental impostors. </w:t>
-      </w:r>
-      <w:r>
-        <w:rPr>
-          <w:rFonts w:ascii="Arial" w:hAnsi="Arial" w:cs="Arial"/>
-          <w:sz w:val="22"/>
-          <w:szCs w:val="22"/>
-        </w:rPr>
-        <w:t>Require transient excursions to be coherent across adjacent CCDs rather than accepting an isolated measurement. Test every candidate against scan angle, close neighbours, source morphology, gate and window changes, CCD identity, background, saturation and source-ID history. Slower high-amplitude variables and scanning-law aliases will be included as explicit contaminant classes, and thresholds will be set by false-discovery rate rather than by nominal single-source significance.</w:t>
+        <w:t xml:space="preserve">Control false positives and scale to the sky. </w:t>
+      </w:r>
+      <w:r>
+        <w:rPr>
+          <w:rFonts w:ascii="Arial" w:hAnsi="Arial" w:cs="Arial"/>
+          <w:sz w:val="22"/>
+          <w:szCs w:val="22"/>
+        </w:rPr>
+        <w:t>Check candidates against scan angle, neighbours, crowding, background, CCD, gate and window configuration, saturation, and source history. Signals shared by many stars observed under the same instrumental configuration can reveal calibration failures. The search will start with a well-measured, computationally manageable sample and expand towards an all-sky analysis as these controls are validated.</w:t>
       </w:r>
     </w:p>
     <w:p>
@@ -413,33 +413,33 @@
           <w:b/>
           <w:bCs/>
         </w:rPr>
-        <w:t xml:space="preserve">Measure completeness and study the best objects. </w:t>
-      </w:r>
-      <w:r>
-        <w:rPr>
-          <w:rFonts w:ascii="Arial" w:hAnsi="Arial" w:cs="Arial"/>
-          <w:sz w:val="22"/>
-          <w:szCs w:val="22"/>
-        </w:rPr>
-        <w:t>Inject exposure-integrated periodic, eclipsing and flare signals into real control light curves and rerun the full pipeline. This will measure reliability, detection efficiency and period recovery over a defined magnitude and colour range. The best candidates will be classified using Gaia colour–magnitude position, parallax and XP information, external catalogues and, where available, TESS, Kepler/K2, ZTF or dedicated high-speed photometry.</w:t>
-      </w:r>
-    </w:p>
-    <w:p>
-      <w:pPr>
-        <w:spacing w:before="40" w:after="0" w:line="360" w:lineRule="auto"/>
-        <w:rPr>
-          <w:rFonts w:ascii="Arial" w:hAnsi="Arial" w:cs="Arial"/>
-          <w:sz w:val="22"/>
-          <w:szCs w:val="22"/>
-        </w:rPr>
-      </w:pPr>
-      <w:r>
-        <w:rPr>
-          <w:rFonts w:ascii="Arial" w:hAnsi="Arial" w:cs="Arial"/>
-          <w:sz w:val="22"/>
-          <w:szCs w:val="22"/>
-        </w:rPr>
-        <w:t>The core deliverables are a validated rapid-variability pipeline, a high-purity candidate catalogue, a measured selection function and detailed classifications for a handful of new or poorly studied systems. Extensions could search selected sources outside the Gaia short-timescale table, estimate class-specific occurrence rates or develop an anomaly search. If DR4 access is delayed or initially overloaded, the same machinery supports a complete forecasting study based on injected and resampled TESS/Kepler signals, the published DR2 candidates and a ranked list of DR4 targets.</w:t>
+        <w:t xml:space="preserve">Map and interpret the discoveries. </w:t>
+      </w:r>
+      <w:r>
+        <w:rPr>
+          <w:rFonts w:ascii="Arial" w:hAnsi="Arial" w:cs="Arial"/>
+          <w:sz w:val="22"/>
+          <w:szCs w:val="22"/>
+        </w:rPr>
+        <w:t>Use Gaia time series, colours, astrometry, and external catalogues to characterise the strongest candidates. For stars with reliable parallaxes, construct an HR diagram coloured by a calibrated measure of minute-timescale variability. Account for magnitude-dependent sensitivity, transit count, cadence, selection, and extinction before interpreting structure. Known populations check the calibration; new concentrations and isolated outliers become discovery targets.</w:t>
+      </w:r>
+    </w:p>
+    <w:p>
+      <w:pPr>
+        <w:spacing w:before="40" w:after="0" w:line="360" w:lineRule="auto"/>
+        <w:rPr>
+          <w:rFonts w:ascii="Arial" w:hAnsi="Arial" w:cs="Arial"/>
+          <w:sz w:val="22"/>
+          <w:szCs w:val="22"/>
+        </w:rPr>
+      </w:pPr>
+      <w:r>
+        <w:rPr>
+          <w:rFonts w:ascii="Arial" w:hAnsi="Arial" w:cs="Arial"/>
+          <w:sz w:val="22"/>
+          <w:szCs w:val="22"/>
+        </w:rPr>
+        <w:t>The main deliverables will be a tested calibration and search pipeline, a ranked catalogue of credible minute-timescale variables, and an HR-diagram map of fast variability across stellar populations. Detailed studies of the strongest candidates will provide an initial astrophysical interpretation. The project is deliberately exploratory and will preserve unfamiliar signals and unexpected regions of the HR diagram rather than force every candidate into a known class.</w:t>
       </w:r>
     </w:p>
     <w:p>
@@ -471,7 +471,7 @@
           <w:sz w:val="22"/>
           <w:szCs w:val="22"/>
         </w:rPr>
-        <w:t>The student should be comfortable with Python and basic probability and statistics. Prior experience with astronomical time series is useful but not required. The project suits someone who enjoys diagnosing real data: instrumental systematics, correlated noise and selection effects are as important as the period-search algorithms.</w:t>
+        <w:t>The student should be comfortable with Python and basic probability and statistics. Experience with astronomical time series is useful but not required. The project suits someone who enjoys discovery work in real data, where understanding calibration and false positives is as important as finding unusual objects.</w:t>
       </w:r>
     </w:p>
     <w:p>
@@ -509,7 +509,7 @@
           <w:sz w:val="22"/>
           <w:szCs w:val="22"/>
         </w:rPr>
-        <w:t>Gaia Archive queries, ADQL and targeted DataLink retrieval of epoch data.</w:t>
+        <w:t>Gaia Archive queries, ADQL, and targeted retrieval of epoch photometry.</w:t>
       </w:r>
     </w:p>
     <w:p>
@@ -533,7 +533,7 @@
           <w:sz w:val="22"/>
           <w:szCs w:val="22"/>
         </w:rPr>
-        <w:t>Irregular time-series analysis, period searches, transient templates and spectral-window interpretation.</w:t>
+        <w:t>Calibration of time-series measurements and construction of matched control samples.</w:t>
       </w:r>
     </w:p>
     <w:p>
@@ -557,7 +557,7 @@
           <w:sz w:val="22"/>
           <w:szCs w:val="22"/>
         </w:rPr>
-        <w:t>Robust statistics, correlated-noise models and false-discovery control at large scale.</w:t>
+        <w:t>Robust variability statistics, candidate ranking, and false-positive control.</w:t>
       </w:r>
     </w:p>
     <w:p>
@@ -581,7 +581,7 @@
           <w:sz w:val="22"/>
           <w:szCs w:val="22"/>
         </w:rPr>
-        <w:t>Injection–recovery experiments and class-dependent completeness measurements.</w:t>
+        <w:t>Injection-recovery tests and measurement of sensitivity across magnitude and colour.</w:t>
       </w:r>
     </w:p>
     <w:p>
@@ -605,7 +605,7 @@
           <w:sz w:val="22"/>
           <w:szCs w:val="22"/>
         </w:rPr>
-        <w:t>Cross-matching, stellar classification and reproducible handling of large catalogues.</w:t>
+        <w:t>Cross-matching, HR diagrams, and reproducible catalogue analysis.</w:t>
       </w:r>
     </w:p>
     <w:p>
@@ -675,7 +675,7 @@
           <w:sz w:val="22"/>
           <w:szCs w:val="22"/>
         </w:rPr>
-        <w:t>ESA/DPAC, ‘Gaia DR4 content and expected archive products’. https://www.cosmos.esa.int/web/gaia/dr4</w:t>
+        <w:t>ESA/DPAC, 'Gaia DR4 content and expected archive products'. https://www.cosmos.esa.int/web/gaia/dr4</w:t>
       </w:r>
     </w:p>
     <w:p>
@@ -699,7 +699,7 @@
           <w:sz w:val="22"/>
           <w:szCs w:val="22"/>
         </w:rPr>
-        <w:t>Roelens, M. et al. (2017), ‘Short time-scale variables in the Gaia era’, MNRAS, 472, 3230. https://doi.org/10.1093/mnras/stx2115</w:t>
+        <w:t>Roelens, M. et al. (2017), 'Short time-scale variables in the Gaia era: detection and characterization by structure function analysis', MNRAS, 472, 3230. https://doi.org/10.1093/mnras/stx2115</w:t>
       </w:r>
     </w:p>
     <w:p>
@@ -723,7 +723,7 @@
           <w:sz w:val="22"/>
           <w:szCs w:val="22"/>
         </w:rPr>
-        <w:t>Roelens, M. et al. (2018), ‘Gaia Data Release 2: Short-timescale variability processing and analysis’, A&amp;A, 620, A197. https://doi.org/10.1051/0004-6361/201833357</w:t>
+        <w:t>Roelens, M. et al. (2018), 'Gaia Data Release 2: Short-timescale variability processing and analysis', A&amp;A, 620, A197. https://doi.org/10.1051/0004-6361/201833357</w:t>
       </w:r>
     </w:p>
     <w:p>
@@ -747,7 +747,7 @@
           <w:sz w:val="22"/>
           <w:szCs w:val="22"/>
         </w:rPr>
-        <w:t>Holl, B. et al. (2023), ‘Gaia Data Release 3: Gaia scan-angle-dependent signals and spurious periods’, A&amp;A, 674, A25. https://doi.org/10.1051/0004-6361/202245353</w:t>
+        <w:t>Holl, B. et al. (2023), 'Gaia Data Release 3: Gaia scan-angle-dependent signals and spurious periods', A&amp;A, 674, A25. https://doi.org/10.1051/0004-6361/202245353</w:t>
       </w:r>
     </w:p>
     <w:p>
@@ -771,7 +771,7 @@
           <w:sz w:val="22"/>
           <w:szCs w:val="22"/>
         </w:rPr>
-        <w:t>Wevers, T. et al. (2018), ‘The fast transient sky with Gaia’, MNRAS, 473, 3854. https://doi.org/10.1093/mnras/stx2625</w:t>
+        <w:t>Gavras, P. et al. (2023), 'Gaia Data Release 3: Cross-match of Gaia sources with variable objects from the literature', A&amp;A, 674, A22. https://doi.org/10.1051/0004-6361/202244367</w:t>
       </w:r>
     </w:p>
     <w:p>
@@ -795,7 +795,7 @@
           <w:sz w:val="22"/>
           <w:szCs w:val="22"/>
         </w:rPr>
-        <w:t>Prusti, T. et al. (2016), ‘The Gaia mission’, A&amp;A, 595, A1. https://doi.org/10.1051/0004-6361/201629272</w:t>
+        <w:t>Gaia Collaboration et al. (2019), 'Gaia Data Release 2: Variable stars in the colour-absolute magnitude diagram', A&amp;A, 623, A110. https://doi.org/10.1051/0004-6361/201833304</w:t>
       </w:r>
     </w:p>
     <w:p>
@@ -833,7 +833,7 @@
           <w:sz w:val="22"/>
           <w:szCs w:val="22"/>
         </w:rPr>
-        <w:t>ESA/DPAC, ‘Gaia data-release scenario’. https://www.cosmos.esa.int/web/gaia/release</w:t>
+        <w:t>ESA, 'Gaia mission and upcoming data releases'. https://www.esa.int/Science_Exploration/Space_Science/Gaia</w:t>
       </w:r>
     </w:p>
     <w:p>
@@ -857,7 +857,7 @@
           <w:sz w:val="22"/>
           <w:szCs w:val="22"/>
         </w:rPr>
-        <w:t>Riello, M. et al. (2021), ‘Gaia Early Data Release 3: Photometric content and validation’, A&amp;A, 649, A3. https://doi.org/10.1051/0004-6361/202039587</w:t>
+        <w:t>Riello, M. et al. (2021), 'Gaia Early Data Release 3: Photometric content and validation', A&amp;A, 649, A3. https://doi.org/10.1051/0004-6361/202039587</w:t>
       </w:r>
     </w:p>
     <w:p>
@@ -881,7 +881,7 @@
           <w:sz w:val="22"/>
           <w:szCs w:val="22"/>
         </w:rPr>
-        <w:t>Ricker, G. R. et al. (2015), ‘Transiting Exoplanet Survey Satellite’, Journal of Astronomical Telescopes, Instruments, and Systems, 1, 014003. https://doi.org/10.1117/1.JATIS.1.1.014003</w:t>
+        <w:t>Gaia Collaboration et al. (2016), 'The Gaia mission', A&amp;A, 595, A1. https://doi.org/10.1051/0004-6361/201629272</w:t>
       </w:r>
     </w:p>
     <w:p>
@@ -905,7 +905,7 @@
           <w:sz w:val="22"/>
           <w:szCs w:val="22"/>
         </w:rPr>
-        <w:t>Bellm, E. C. et al. (2019), ‘The Zwicky Transient Facility: System Overview, Performance, and First Results’, PASP, 131, 018002. https://doi.org/10.1088/1538-3873/aaecbe</w:t>
+        <w:t>Eyer, L. et al. (2023), 'Gaia Data Release 3: Summary of the variability processing and analysis', A&amp;A, 674, A13. https://doi.org/10.1051/0004-6361/202244242</w:t>
       </w:r>
     </w:p>
     <w:sectPr>

</xml_diff>

<commit_message>
Project 4: cite the 8.8-min eclipsing double WD as a concrete example
Add ZTF J2243+5242 (Burdge et al. 2020b, ApJL 905 L7) as the anchor example
for close-binary eclipse/modulation on minute timescales - fully
characterised from photometry alone. Disambiguate from the already-cited
Burdge et al. 2020 ZTF systematic search (now 2020a, ApJ 905 32).

Co-Authored-By: Claude Opus 4.8 <noreply@anthropic.com>
</commit_message>
<xml_diff>
--- a/04_Gaia_DR4_Minute_Timescale_Variability.docx
+++ b/04_Gaia_DR4_Minute_Timescale_Variability.docx
@@ -134,7 +134,7 @@
         </w:rPr>
       </w:pPr>
       <w:r>
-        <w:t>Very few experiments can probe minute-timescale variability over wide parts of the sky. High-cadence surveys either cover the whole sky but shallowly, like Evryscope (Law et al. 2015), or reach faint stars over only a small area, like OmegaWhite (Macfarlane et al. 2015); dedicated deep fields buy depth at the cost of sky. So the space density of the fastest variables is barely mapped — even though these systems matter: ultracompact binaries of two white dwarfs, and AM CVn systems with orbital periods of minutes, are among the loudest Galactic sources for the future LISA gravitational-wave mission and a direct test of how compact binaries form and merge (Burdge et al. 2020). Gaia DR4 changes this. Its per-CCD photometry samples the whole sky at a cadence of seconds, so for the first time a single, uniform experiment can search for minute-timescale variability everywhere at once. Rapid brightness changes spring from many kinds of system: pulsating white dwarfs, hot subdwarfs, and other compact pulsators probe stellar interiors; close binaries eclipse or modulate over minutes; accreting and magnetic systems flicker and spin; active stars flare. This project therefore searches without fixing a stellar type or a preferred light-curve shape, letting both familiar populations and surprises rise out of the data. Not every dip is intrinsic, either: a distant Kuiper-belt or Oort-cloud body can occult a background star for a fraction of a second. Ofek et al. (2024) show that roughly one-second integrations can probe such occultations; whether a signal survives dilution in Gaia's longer CCD integrations is a testable question.</w:t>
+        <w:t>Very few experiments can probe minute-timescale variability over wide parts of the sky. High-cadence surveys either cover the whole sky but shallowly, like Evryscope (Law et al. 2015), or reach faint stars over only a small area, like OmegaWhite (Macfarlane et al. 2015); dedicated deep fields buy depth at the cost of sky. So the space density of the fastest variables is barely mapped — even though these systems matter: ultracompact binaries of two white dwarfs, and AM CVn systems with orbital periods of minutes, are among the loudest Galactic sources for the future LISA gravitational-wave mission and a direct test of how compact binaries form and merge (Burdge et al. 2020a). Gaia DR4 changes this. Its per-CCD photometry samples the whole sky at a cadence of seconds, so for the first time a single, uniform experiment can search for minute-timescale variability everywhere at once. Rapid brightness changes spring from many kinds of system: pulsating white dwarfs, hot subdwarfs, and other compact pulsators probe stellar interiors; close binaries eclipse or modulate over minutes — the shortest known, the 8.8-minute eclipsing double white dwarf ZTF J2243+5242, was itself found and fully characterised from photometry alone (Burdge et al. 2020b); accreting and magnetic systems flicker and spin; active stars flare. This project therefore searches without fixing a stellar type or a preferred light-curve shape, letting both familiar populations and surprises rise out of the data. Not every dip is intrinsic, either: a distant Kuiper-belt or Oort-cloud body can occult a background star for a fraction of a second. Ofek et al. (2024) show that roughly one-second integrations can probe such occultations; whether a signal survives dilution in Gaia's longer CCD integrations is a testable question.</w:t>
       </w:r>
     </w:p>
     <w:p>
@@ -840,7 +840,26 @@
         </w:rPr>
       </w:pPr>
       <w:r>
-        <w:t>Burdge, K. B. et al. (2020), ‘A systematic search of Zwicky Transient Facility data for ultracompact binary LISA-detectable gravitational-wave sources’, ApJ, 905, 32. https://doi.org/10.3847/1538-4357/abc261</w:t>
+        <w:t>Burdge, K. B. et al. (2020a), ‘A systematic search of Zwicky Transient Facility data for ultracompact binary LISA-detectable gravitational-wave sources’, ApJ, 905, 32. https://doi.org/10.3847/1538-4357/abc261</w:t>
+      </w:r>
+    </w:p>
+    <w:p>
+      <w:pPr>
+        <w:pStyle w:val="ListParagraph"/>
+        <w:keepLines/>
+        <w:numPr>
+          <w:ilvl w:val="0"/>
+          <w:numId w:val="1"/>
+        </w:numPr>
+        <w:spacing w:before="40" w:after="0" w:line="360" w:lineRule="auto"/>
+        <w:rPr>
+          <w:rFonts w:ascii="Arial" w:hAnsi="Arial" w:cs="Arial"/>
+          <w:sz w:val="22"/>
+          <w:szCs w:val="22"/>
+        </w:rPr>
+      </w:pPr>
+      <w:r>
+        <w:t>Burdge, K. B. et al. (2020b), ‘An 8.8 Minute Orbital Period Eclipsing Detached Double White Dwarf Binary’, ApJL, 905, L7. https://doi.org/10.3847/2041-8213/abca91</w:t>
       </w:r>
     </w:p>
     <w:p>

</xml_diff>

<commit_message>
Add Dolev Bashi as supervisor on projects 2 and 4
</commit_message>
<xml_diff>
--- a/04_Gaia_DR4_Minute_Timescale_Variability.docx
+++ b/04_Gaia_DR4_Minute_Timescale_Variability.docx
@@ -50,6 +50,24 @@
           <w:szCs w:val="22"/>
         </w:rPr>
         <w:t>Supervisor II: Professor Sergey Koposov (skoposov@ed.ac.uk)</w:t>
+      </w:r>
+    </w:p>
+    <w:p>
+      <w:pPr>
+        <w:spacing w:before="40" w:after="0" w:line="360" w:lineRule="auto"/>
+        <w:rPr>
+          <w:rFonts w:ascii="Arial" w:hAnsi="Arial" w:cs="Arial"/>
+          <w:sz w:val="22"/>
+          <w:szCs w:val="22"/>
+        </w:rPr>
+      </w:pPr>
+      <w:r>
+        <w:rPr>
+          <w:rFonts w:ascii="Arial" w:hAnsi="Arial" w:cs="Arial"/>
+          <w:sz w:val="22"/>
+          <w:szCs w:val="22"/>
+        </w:rPr>
+        <w:t>Supervisor III: Dr. Dolev Bashi (db975@cam.ac.uk)</w:t>
       </w:r>
     </w:p>
     <w:p>

</xml_diff>